<commit_message>
docs: regenerate all 8 suite setup guides
Replace 3 existing guides (OCP, Etcd, KubeVirt) with updated versions
reflecting current DS counts and metrics. Add 5 new guides for ODF, ACM,
GitOps/ArgoCD, Portworx, and Nexus. All guides follow consistent format:
prerequisites, what you get, OpenShift/Nexus config, LM import steps,
device config, verification, token rotation, troubleshooting, metrics ref.
</commit_message>
<xml_diff>
--- a/documentation/Etcd_Monitoring_Setup_Guide.docx
+++ b/documentation/Etcd_Monitoring_Setup_Guide.docx
@@ -5,7 +5,6 @@
     <w:p>
       <w:pPr>
         <w:pStyle w:val="Heading1"/>
-        <w:jc w:val="left"/>
       </w:pPr>
       <w:r>
         <w:t>OpenShift Etcd Monitoring via Thanos Querier</w:t>
@@ -13,12 +12,7 @@
     </w:p>
     <w:p>
       <w:r>
-        <w:t>Setup guide for monitoring OpenShift etcd clusters using LogicMonitor DataSources that query the Thanos Querier API. These DataSources monitor etcd leader health, disk latency, consensus proposals, database size, and peer network metrics.</w:t>
-      </w:r>
-    </w:p>
-    <w:p>
-      <w:r>
-        <w:t>This uses the same Thanos Querier integration pattern as the KubeVirt monitoring suite. If you already have a device with openshift.thanos.* properties configured, skip to Step 2.</w:t>
+        <w:t>Setup guide for monitoring OpenShift etcd clusters using LogicMonitor DataSources that query the Thanos Querier API. Etcd is a core control plane component present on all OpenShift clusters.</w:t>
       </w:r>
     </w:p>
     <w:p>
@@ -76,7 +70,7 @@
     </w:p>
     <w:tbl>
       <w:tblPr>
-        <w:tblStyle w:val="LightGrid-Accent1"/>
+        <w:tblStyle w:val="TableGrid"/>
         <w:tblW w:type="auto" w:w="0"/>
         <w:tblLook w:firstColumn="1" w:firstRow="1" w:lastColumn="0" w:lastRow="0" w:noHBand="0" w:noVBand="1" w:val="04A0"/>
       </w:tblPr>
@@ -165,7 +159,7 @@
           </w:tcPr>
           <w:p>
             <w:r>
-              <w:t>Member counts, leader health, aggregate proposals</w:t>
+              <w:t>Member counts, leader health, DB size</w:t>
             </w:r>
           </w:p>
         </w:tc>
@@ -207,7 +201,7 @@
           </w:tcPr>
           <w:p>
             <w:r>
-              <w:t>Discovers members, tracks leader status</w:t>
+              <w:t>Leader status and leader detection</w:t>
             </w:r>
           </w:p>
         </w:tc>
@@ -249,7 +243,7 @@
           </w:tcPr>
           <w:p>
             <w:r>
-              <w:t>WAL/commit latency, proposals, db size, peer network</w:t>
+              <w:t>WAL fsync, commit latency, proposals</w:t>
             </w:r>
           </w:p>
         </w:tc>
@@ -372,11 +366,7 @@
         <w:t>oc create serviceaccount logicmonitor-thanos-reader -n openshift-monitoring</w:t>
       </w:r>
     </w:p>
-    <w:p>
-      <w:pPr>
-        <w:pStyle w:val="NoSpacing"/>
-      </w:pPr>
-    </w:p>
+    <w:p/>
     <w:p>
       <w:pPr>
         <w:pStyle w:val="NoSpacing"/>
@@ -396,7 +386,7 @@
     <w:p>
       <w:r>
         <w:br/>
-        <w:t>The cluster-monitoring-view role provides read-only access to all monitoring metrics via the Thanos Querier API, including etcd. It does not grant write access or access to non-monitoring resources.</w:t>
+        <w:t>The cluster-monitoring-view role provides read-only access to all monitoring metrics via the Thanos Querier API.</w:t>
       </w:r>
     </w:p>
     <w:p>
@@ -418,63 +408,7 @@
     <w:p>
       <w:r>
         <w:br/>
-        <w:t>The token is printed to stdout. Copy it immediately and store it securely. The duration flag creates a token valid for 1 year. Set a calendar reminder 30 days before expiration to rotate.</w:t>
-      </w:r>
-    </w:p>
-    <w:p>
-      <w:pPr>
-        <w:pStyle w:val="Heading3"/>
-      </w:pPr>
-      <w:r>
-        <w:t>1.4 Verify Connectivity</w:t>
-      </w:r>
-    </w:p>
-    <w:p>
-      <w:r>
-        <w:t>Test that the token works against an etcd metric:</w:t>
-      </w:r>
-    </w:p>
-    <w:p>
-      <w:pPr>
-        <w:pStyle w:val="NoSpacing"/>
-      </w:pPr>
-      <w:r>
-        <w:t>THANOS_HOST=$(oc get route thanos-querier -n openshift-monitoring -o jsonpath='{.spec.host}')</w:t>
-      </w:r>
-    </w:p>
-    <w:p>
-      <w:pPr>
-        <w:pStyle w:val="NoSpacing"/>
-      </w:pPr>
-      <w:r>
-        <w:t>TOKEN="&lt;paste-your-token&gt;"</w:t>
-      </w:r>
-    </w:p>
-    <w:p>
-      <w:pPr>
-        <w:pStyle w:val="NoSpacing"/>
-      </w:pPr>
-    </w:p>
-    <w:p>
-      <w:pPr>
-        <w:pStyle w:val="NoSpacing"/>
-      </w:pPr>
-      <w:r>
-        <w:t>curl -sk -H "Authorization: Bearer ${TOKEN}" \</w:t>
-      </w:r>
-    </w:p>
-    <w:p>
-      <w:pPr>
-        <w:pStyle w:val="NoSpacing"/>
-      </w:pPr>
-      <w:r>
-        <w:t xml:space="preserve">  "https://${THANOS_HOST}/api/v1/query?query=etcd_server_has_leader" | python3 -m json.tool</w:t>
-      </w:r>
-    </w:p>
-    <w:p>
-      <w:r>
-        <w:br/>
-        <w:t>Expected: JSON with "status": "success" and a data.result array containing one entry per etcd member (typically 3). If the result is empty, the cluster may not expose etcd metrics through Thanos (see Troubleshooting).</w:t>
+        <w:t>The token is printed to stdout. Copy it immediately and store it securely. The duration flag creates a token valid for 1 year.</w:t>
       </w:r>
     </w:p>
     <w:p>
@@ -487,12 +421,53 @@
     </w:p>
     <w:p>
       <w:r>
-        <w:t>Import the 3 etcd DataSource JSON files provided with this guide:</w:t>
+        <w:t>Import the 3 Etcd DataSource JSON files:</w:t>
       </w:r>
     </w:p>
+    <w:p>
+      <w:pPr>
+        <w:pStyle w:val="ListNumber"/>
+      </w:pPr>
+      <w:r>
+        <w:t>Log in to your LogicMonitor portal</w:t>
+      </w:r>
+    </w:p>
+    <w:p>
+      <w:pPr>
+        <w:pStyle w:val="ListNumber"/>
+      </w:pPr>
+      <w:r>
+        <w:t>Navigate to Settings &gt; LogicModules &gt; DataSources</w:t>
+      </w:r>
+    </w:p>
+    <w:p>
+      <w:pPr>
+        <w:pStyle w:val="ListNumber"/>
+      </w:pPr>
+      <w:r>
+        <w:t>Click Add &gt; Import</w:t>
+      </w:r>
+    </w:p>
+    <w:p>
+      <w:pPr>
+        <w:pStyle w:val="ListNumber"/>
+      </w:pPr>
+      <w:r>
+        <w:t>Select a JSON file and click Import</w:t>
+      </w:r>
+    </w:p>
+    <w:p>
+      <w:pPr>
+        <w:pStyle w:val="ListNumber"/>
+      </w:pPr>
+      <w:r>
+        <w:t>Repeat for all 3 files</w:t>
+      </w:r>
+    </w:p>
+    <w:p/>
     <w:tbl>
       <w:tblPr>
-        <w:tblStyle w:val="LightGrid-Accent1"/>
+        <w:tblStyle w:val="TableGrid"/>
         <w:tblW w:type="auto" w:w="0"/>
         <w:tblLook w:firstColumn="1" w:firstRow="1" w:lastColumn="0" w:lastRow="0" w:noHBand="0" w:noVBand="1" w:val="04A0"/>
       </w:tblPr>
@@ -539,7 +514,7 @@
           </w:tcPr>
           <w:p>
             <w:r>
-              <w:t>Cluster-wide health and aggregate metrics (8 datapoints)</w:t>
+              <w:t>Cluster-wide health and aggregate metrics</w:t>
             </w:r>
           </w:p>
         </w:tc>
@@ -561,7 +536,7 @@
           </w:tcPr>
           <w:p>
             <w:r>
-              <w:t>Discovers etcd members, tracks leader status (2 datapoints)</w:t>
+              <w:t>Discovers etcd members, tracks leader</w:t>
             </w:r>
           </w:p>
         </w:tc>
@@ -583,59 +558,12 @@
           </w:tcPr>
           <w:p>
             <w:r>
-              <w:t>Disk latency, consensus, network per member (13 datapoints)</w:t>
+              <w:t>Per-member latency and proposal metrics</w:t>
             </w:r>
           </w:p>
         </w:tc>
       </w:tr>
     </w:tbl>
-    <w:p/>
-    <w:p>
-      <w:pPr>
-        <w:pStyle w:val="ListNumber"/>
-      </w:pPr>
-      <w:r>
-        <w:t>Log in to your LogicMonitor portal</w:t>
-      </w:r>
-    </w:p>
-    <w:p>
-      <w:pPr>
-        <w:pStyle w:val="ListNumber"/>
-      </w:pPr>
-      <w:r>
-        <w:t>Navigate to Settings &gt; DataSources</w:t>
-      </w:r>
-    </w:p>
-    <w:p>
-      <w:pPr>
-        <w:pStyle w:val="ListNumber"/>
-      </w:pPr>
-      <w:r>
-        <w:t>Click Add &gt; Import</w:t>
-      </w:r>
-    </w:p>
-    <w:p>
-      <w:pPr>
-        <w:pStyle w:val="ListNumber"/>
-      </w:pPr>
-      <w:r>
-        <w:t>Select a JSON file and click Import</w:t>
-      </w:r>
-    </w:p>
-    <w:p>
-      <w:pPr>
-        <w:pStyle w:val="ListNumber"/>
-      </w:pPr>
-      <w:r>
-        <w:t>Repeat for all 3 files</w:t>
-      </w:r>
-    </w:p>
-    <w:p>
-      <w:r>
-        <w:br/>
-        <w:t>All DataSources appear under the Etcd group in the DataSource list.</w:t>
-      </w:r>
-    </w:p>
     <w:p>
       <w:pPr>
         <w:pStyle w:val="Heading2"/>
@@ -646,7 +574,7 @@
     </w:p>
     <w:p>
       <w:r>
-        <w:t>If you already have a device for the Thanos Querier endpoint (e.g., from the KubeVirt suite), the etcd DataSources attach automatically using the same openshift.thanos.* properties. No additional configuration is needed.</w:t>
+        <w:t>If you already have a device for the Thanos Querier endpoint (e.g., from another suite), the new DataSources attach automatically once the PropertySource detects the component.</w:t>
       </w:r>
     </w:p>
     <w:p>
@@ -656,7 +584,7 @@
     </w:p>
     <w:tbl>
       <w:tblPr>
-        <w:tblStyle w:val="LightGrid-Accent1"/>
+        <w:tblStyle w:val="TableGrid"/>
         <w:tblW w:type="auto" w:w="0"/>
         <w:tblLook w:firstColumn="1" w:firstRow="1" w:lastColumn="0" w:lastRow="0" w:noHBand="0" w:noVBand="1" w:val="04A0"/>
       </w:tblPr>
@@ -745,7 +673,7 @@
           </w:tcPr>
           <w:p>
             <w:r>
-              <w:t>Thanos Querier route hostname from Step 1.1</w:t>
+              <w:t>Thanos Querier route hostname (from Step 1.1)</w:t>
             </w:r>
           </w:p>
         </w:tc>
@@ -787,7 +715,7 @@
           </w:tcPr>
           <w:p>
             <w:r>
-              <w:t>Bearer token from Step 1.3</w:t>
+              <w:t>Bearer token (from Step 1.3)</w:t>
             </w:r>
           </w:p>
         </w:tc>
@@ -829,7 +757,7 @@
           </w:tcPr>
           <w:p>
             <w:r>
-              <w:t>Only set if using a non-standard port</w:t>
+              <w:t>Thanos Querier port</w:t>
             </w:r>
           </w:p>
         </w:tc>
@@ -871,7 +799,7 @@
           </w:tcPr>
           <w:p>
             <w:r>
-              <w:t>Set to false only if not behind TLS</w:t>
+              <w:t>Use HTTPS</w:t>
             </w:r>
           </w:p>
         </w:tc>
@@ -880,7 +808,7 @@
     <w:p>
       <w:r>
         <w:br/>
-        <w:t>Once both required properties are set, all 3 etcd DataSources attach automatically via the appliesTo expression: openshift.thanos.host &amp;&amp; openshift.thanos.pass</w:t>
+        <w:t>The PropertySource addCategory_OpenShift_Thanos auto-detects Etcd and sets the appropriate system.categories on the device.</w:t>
       </w:r>
     </w:p>
     <w:p>
@@ -909,7 +837,7 @@
         <w:pStyle w:val="ListNumber"/>
       </w:pPr>
       <w:r>
-        <w:t>Under the DataSources tab, find Etcd Member Discovery</w:t>
+        <w:t>Under the Resources tab, find Etcd Member Discovery</w:t>
       </w:r>
     </w:p>
     <w:p>
@@ -947,7 +875,7 @@
         <w:pStyle w:val="ListBullet"/>
       </w:pPr>
       <w:r>
-        <w:t>1 Etcd Cluster instance on the Cluster Overview DataSource</w:t>
+        <w:t>1 cluster instance on Cluster Overview</w:t>
       </w:r>
     </w:p>
     <w:p>
@@ -1001,7 +929,7 @@
     <w:p>
       <w:r>
         <w:br/>
-        <w:t>Update openshift.thanos.pass on the device in LogicMonitor. The Collector caches properties for 5-10 minutes. Data collection resumes automatically after the cache refreshes.</w:t>
+        <w:t>Update openshift.thanos.pass on the device in LogicMonitor. Data collection resumes within 5-10 minutes.</w:t>
       </w:r>
     </w:p>
     <w:p>
@@ -1014,7 +942,7 @@
     </w:p>
     <w:tbl>
       <w:tblPr>
-        <w:tblStyle w:val="LightGrid-Accent1"/>
+        <w:tblStyle w:val="TableGrid"/>
         <w:tblW w:type="auto" w:w="0"/>
         <w:tblLook w:firstColumn="1" w:firstRow="1" w:lastColumn="0" w:lastRow="0" w:noHBand="0" w:noVBand="1" w:val="04A0"/>
       </w:tblPr>
@@ -1062,7 +990,7 @@
           </w:tcPr>
           <w:p>
             <w:r>
-              <w:t>DataSources not appearing on device</w:t>
+              <w:t>DataSources not appearing</w:t>
             </w:r>
           </w:p>
         </w:tc>
@@ -1072,7 +1000,7 @@
           </w:tcPr>
           <w:p>
             <w:r>
-              <w:t>Missing properties</w:t>
+              <w:t>Missing OpenShift_Etcd category</w:t>
             </w:r>
           </w:p>
         </w:tc>
@@ -1082,7 +1010,7 @@
           </w:tcPr>
           <w:p>
             <w:r>
-              <w:t>Verify openshift.thanos.host and openshift.thanos.pass are set. Names are case-sensitive.</w:t>
+              <w:t>Verify PropertySource ran and set categories</w:t>
             </w:r>
           </w:p>
         </w:tc>
@@ -1094,7 +1022,7 @@
           </w:tcPr>
           <w:p>
             <w:r>
-              <w:t>Discovery returns no instances</w:t>
+              <w:t>No member instances</w:t>
             </w:r>
           </w:p>
         </w:tc>
@@ -1114,7 +1042,7 @@
           </w:tcPr>
           <w:p>
             <w:r>
-              <w:t>Test with curl (Step 1.4). Some managed clusters may restrict etcd metrics.</w:t>
+              <w:t>Test with curl: etcd_server_has_leader query</w:t>
             </w:r>
           </w:p>
         </w:tc>
@@ -1126,7 +1054,7 @@
           </w:tcPr>
           <w:p>
             <w:r>
-              <w:t>HTTP 401 from Thanos</w:t>
+              <w:t>All values are 0</w:t>
             </w:r>
           </w:p>
         </w:tc>
@@ -1136,7 +1064,7 @@
           </w:tcPr>
           <w:p>
             <w:r>
-              <w:t>Token expired or invalid</w:t>
+              <w:t>Token lacks permissions</w:t>
             </w:r>
           </w:p>
         </w:tc>
@@ -1146,71 +1074,7 @@
           </w:tcPr>
           <w:p>
             <w:r>
-              <w:t>Regenerate the token (see Token Rotation).</w:t>
-            </w:r>
-          </w:p>
-        </w:tc>
-      </w:tr>
-      <w:tr>
-        <w:tc>
-          <w:tcPr>
-            <w:tcW w:type="dxa" w:w="2880"/>
-          </w:tcPr>
-          <w:p>
-            <w:r>
-              <w:t>HTTP 403 from Thanos</w:t>
-            </w:r>
-          </w:p>
-        </w:tc>
-        <w:tc>
-          <w:tcPr>
-            <w:tcW w:type="dxa" w:w="2880"/>
-          </w:tcPr>
-          <w:p>
-            <w:r>
-              <w:t>Missing ClusterRole</w:t>
-            </w:r>
-          </w:p>
-        </w:tc>
-        <w:tc>
-          <w:tcPr>
-            <w:tcW w:type="dxa" w:w="2880"/>
-          </w:tcPr>
-          <w:p>
-            <w:r>
-              <w:t>Re-run: oc adm policy add-cluster-role-to-user cluster-monitoring-view -z logicmonitor-thanos-reader -n openshift-monitoring</w:t>
-            </w:r>
-          </w:p>
-        </w:tc>
-      </w:tr>
-      <w:tr>
-        <w:tc>
-          <w:tcPr>
-            <w:tcW w:type="dxa" w:w="2880"/>
-          </w:tcPr>
-          <w:p>
-            <w:r>
-              <w:t>All zeros after token refresh</w:t>
-            </w:r>
-          </w:p>
-        </w:tc>
-        <w:tc>
-          <w:tcPr>
-            <w:tcW w:type="dxa" w:w="2880"/>
-          </w:tcPr>
-          <w:p>
-            <w:r>
-              <w:t>Property cache delay</w:t>
-            </w:r>
-          </w:p>
-        </w:tc>
-        <w:tc>
-          <w:tcPr>
-            <w:tcW w:type="dxa" w:w="2880"/>
-          </w:tcPr>
-          <w:p>
-            <w:r>
-              <w:t>Wait 5-10 minutes for the Collector property cache to refresh.</w:t>
+              <w:t>Verify token with curl test from Step 1</w:t>
             </w:r>
           </w:p>
         </w:tc>
@@ -1229,12 +1093,12 @@
         <w:pStyle w:val="Heading3"/>
       </w:pPr>
       <w:r>
-        <w:t>Etcd Member Discovery (2 datapoints)</w:t>
+        <w:t>Member Discovery (2 datapoints)</w:t>
       </w:r>
     </w:p>
     <w:tbl>
       <w:tblPr>
-        <w:tblStyle w:val="LightGrid-Accent1"/>
+        <w:tblStyle w:val="TableGrid"/>
         <w:tblW w:type="auto" w:w="0"/>
         <w:tblLook w:firstColumn="1" w:firstRow="1" w:lastColumn="0" w:lastRow="0" w:noHBand="0" w:noVBand="1" w:val="04A0"/>
       </w:tblPr>
@@ -1292,7 +1156,7 @@
           </w:tcPr>
           <w:p>
             <w:r>
-              <w:t>1 if member sees a leader, 0 if not</w:t>
+              <w:t>1 if member sees a leader</w:t>
             </w:r>
           </w:p>
         </w:tc>
@@ -1324,7 +1188,7 @@
           </w:tcPr>
           <w:p>
             <w:r>
-              <w:t>1 if this member is the current leader</w:t>
+              <w:t>1 if this member is the leader</w:t>
             </w:r>
           </w:p>
         </w:tc>
@@ -1340,18 +1204,17 @@
         </w:tc>
       </w:tr>
     </w:tbl>
-    <w:p/>
     <w:p>
       <w:pPr>
         <w:pStyle w:val="Heading3"/>
       </w:pPr>
       <w:r>
-        <w:t>Etcd Member Performance (13 datapoints)</w:t>
+        <w:t>Member Performance (13 datapoints)</w:t>
       </w:r>
     </w:p>
     <w:tbl>
       <w:tblPr>
-        <w:tblStyle w:val="LightGrid-Accent1"/>
+        <w:tblStyle w:val="TableGrid"/>
         <w:tblW w:type="auto" w:w="0"/>
         <w:tblLook w:firstColumn="1" w:firstRow="1" w:lastColumn="0" w:lastRow="0" w:noHBand="0" w:noVBand="1" w:val="04A0"/>
       </w:tblPr>
@@ -1569,7 +1432,7 @@
           </w:tcPr>
           <w:p>
             <w:r>
-              <w:t>WAL fsync p99 latency (ms)</w:t>
+              <w:t>WAL fsync p99 latency in ms</w:t>
             </w:r>
           </w:p>
         </w:tc>
@@ -1601,7 +1464,7 @@
           </w:tcPr>
           <w:p>
             <w:r>
-              <w:t>Backend commit p99 latency (ms)</w:t>
+              <w:t>Backend commit p99 latency in ms</w:t>
             </w:r>
           </w:p>
         </w:tc>
@@ -1623,7 +1486,7 @@
           </w:tcPr>
           <w:p>
             <w:r>
-              <w:t>db_total_size</w:t>
+              <w:t>db_size_bytes</w:t>
             </w:r>
           </w:p>
         </w:tc>
@@ -1633,7 +1496,7 @@
           </w:tcPr>
           <w:p>
             <w:r>
-              <w:t>Database size (bytes)</w:t>
+              <w:t>Database size in bytes</w:t>
             </w:r>
           </w:p>
         </w:tc>
@@ -1643,7 +1506,7 @@
           </w:tcPr>
           <w:p>
             <w:r>
-              <w:t>&gt; 6GB</w:t>
+              <w:t>&gt; 6442450944</w:t>
             </w:r>
           </w:p>
         </w:tc>
@@ -1655,7 +1518,7 @@
           </w:tcPr>
           <w:p>
             <w:r>
-              <w:t>db_in_use_size</w:t>
+              <w:t>db_size_in_use_bytes</w:t>
             </w:r>
           </w:p>
         </w:tc>
@@ -1665,7 +1528,7 @@
           </w:tcPr>
           <w:p>
             <w:r>
-              <w:t>Database size in use (bytes)</w:t>
+              <w:t>Database in-use size in bytes</w:t>
             </w:r>
           </w:p>
         </w:tc>
@@ -1687,7 +1550,7 @@
           </w:tcPr>
           <w:p>
             <w:r>
-              <w:t>keys_total</w:t>
+              <w:t>snapshot_save_duration_p99</w:t>
             </w:r>
           </w:p>
         </w:tc>
@@ -1697,7 +1560,7 @@
           </w:tcPr>
           <w:p>
             <w:r>
-              <w:t>Total keys in store</w:t>
+              <w:t>Snapshot save p99 in ms</w:t>
             </w:r>
           </w:p>
         </w:tc>
@@ -1719,7 +1582,7 @@
           </w:tcPr>
           <w:p>
             <w:r>
-              <w:t>peer_rtt_p99</w:t>
+              <w:t>network_peer_sent_rate</w:t>
             </w:r>
           </w:p>
         </w:tc>
@@ -1729,7 +1592,7 @@
           </w:tcPr>
           <w:p>
             <w:r>
-              <w:t>Peer round-trip time p99 (ms)</w:t>
+              <w:t>Network bytes sent/sec</w:t>
             </w:r>
           </w:p>
         </w:tc>
@@ -1751,7 +1614,7 @@
           </w:tcPr>
           <w:p>
             <w:r>
-              <w:t>peer_sent_bytes</w:t>
+              <w:t>network_peer_recv_rate</w:t>
             </w:r>
           </w:p>
         </w:tc>
@@ -1761,7 +1624,7 @@
           </w:tcPr>
           <w:p>
             <w:r>
-              <w:t>Peer sent bytes/sec</w:t>
+              <w:t>Network bytes received/sec</w:t>
             </w:r>
           </w:p>
         </w:tc>
@@ -1783,7 +1646,7 @@
           </w:tcPr>
           <w:p>
             <w:r>
-              <w:t>peer_received_bytes</w:t>
+              <w:t>grpc_request_rate</w:t>
             </w:r>
           </w:p>
         </w:tc>
@@ -1793,7 +1656,7 @@
           </w:tcPr>
           <w:p>
             <w:r>
-              <w:t>Peer received bytes/sec</w:t>
+              <w:t>gRPC requests/sec</w:t>
             </w:r>
           </w:p>
         </w:tc>
@@ -1809,18 +1672,17 @@
         </w:tc>
       </w:tr>
     </w:tbl>
-    <w:p/>
     <w:p>
       <w:pPr>
         <w:pStyle w:val="Heading3"/>
       </w:pPr>
       <w:r>
-        <w:t>Etcd Cluster Overview (8 datapoints)</w:t>
+        <w:t>Cluster Overview (8 datapoints)</w:t>
       </w:r>
     </w:p>
     <w:tbl>
       <w:tblPr>
-        <w:tblStyle w:val="LightGrid-Accent1"/>
+        <w:tblStyle w:val="TableGrid"/>
         <w:tblW w:type="auto" w:w="0"/>
         <w:tblLook w:firstColumn="1" w:firstRow="1" w:lastColumn="0" w:lastRow="0" w:noHBand="0" w:noVBand="1" w:val="04A0"/>
       </w:tblPr>
@@ -1932,7 +1794,7 @@
           </w:tcPr>
           <w:p>
             <w:r>
-              <w:t>leaders_active</w:t>
+              <w:t>leader_count</w:t>
             </w:r>
           </w:p>
         </w:tc>
@@ -1942,7 +1804,7 @@
           </w:tcPr>
           <w:p>
             <w:r>
-              <w:t>Active leaders</w:t>
+              <w:t>Number of leaders (should be 1)</w:t>
             </w:r>
           </w:p>
         </w:tc>
@@ -1952,7 +1814,7 @@
           </w:tcPr>
           <w:p>
             <w:r>
-              <w:t>!= 1</w:t>
+              <w:t>--</w:t>
             </w:r>
           </w:p>
         </w:tc>
@@ -1964,7 +1826,7 @@
           </w:tcPr>
           <w:p>
             <w:r>
-              <w:t>total_db_size</w:t>
+              <w:t>db_total_size_bytes</w:t>
             </w:r>
           </w:p>
         </w:tc>
@@ -1974,7 +1836,7 @@
           </w:tcPr>
           <w:p>
             <w:r>
-              <w:t>Aggregate database size</w:t>
+              <w:t>Total DB size across members</w:t>
             </w:r>
           </w:p>
         </w:tc>
@@ -2006,7 +1868,7 @@
           </w:tcPr>
           <w:p>
             <w:r>
-              <w:t>Aggregate key count</w:t>
+              <w:t>Total key count</w:t>
             </w:r>
           </w:p>
         </w:tc>
@@ -2028,7 +1890,7 @@
           </w:tcPr>
           <w:p>
             <w:r>
-              <w:t>proposals_pending_total</w:t>
+              <w:t>cluster_version</w:t>
             </w:r>
           </w:p>
         </w:tc>
@@ -2038,39 +1900,7 @@
           </w:tcPr>
           <w:p>
             <w:r>
-              <w:t>Aggregate pending proposals</w:t>
-            </w:r>
-          </w:p>
-        </w:tc>
-        <w:tc>
-          <w:tcPr>
-            <w:tcW w:type="dxa" w:w="2880"/>
-          </w:tcPr>
-          <w:p>
-            <w:r>
-              <w:t>&gt; 100</w:t>
-            </w:r>
-          </w:p>
-        </w:tc>
-      </w:tr>
-      <w:tr>
-        <w:tc>
-          <w:tcPr>
-            <w:tcW w:type="dxa" w:w="2880"/>
-          </w:tcPr>
-          <w:p>
-            <w:r>
-              <w:t>leader_changes_total</w:t>
-            </w:r>
-          </w:p>
-        </w:tc>
-        <w:tc>
-          <w:tcPr>
-            <w:tcW w:type="dxa" w:w="2880"/>
-          </w:tcPr>
-          <w:p>
-            <w:r>
-              <w:t>Aggregate leader election rate</w:t>
+              <w:t>Cluster version number</w:t>
             </w:r>
           </w:p>
         </w:tc>
@@ -2092,7 +1922,7 @@
           </w:tcPr>
           <w:p>
             <w:r>
-              <w:t>proposals_failed_total</w:t>
+              <w:t>wal_fsync_max_p99</w:t>
             </w:r>
           </w:p>
         </w:tc>
@@ -2102,7 +1932,7 @@
           </w:tcPr>
           <w:p>
             <w:r>
-              <w:t>Aggregate failed proposal rate</w:t>
+              <w:t>Highest WAL fsync p99 across members</w:t>
             </w:r>
           </w:p>
         </w:tc>
@@ -2112,7 +1942,39 @@
           </w:tcPr>
           <w:p>
             <w:r>
-              <w:t>&gt; 0</w:t>
+              <w:t>&gt; 15</w:t>
+            </w:r>
+          </w:p>
+        </w:tc>
+      </w:tr>
+      <w:tr>
+        <w:tc>
+          <w:tcPr>
+            <w:tcW w:type="dxa" w:w="2880"/>
+          </w:tcPr>
+          <w:p>
+            <w:r>
+              <w:t>backend_commit_max_p99</w:t>
+            </w:r>
+          </w:p>
+        </w:tc>
+        <w:tc>
+          <w:tcPr>
+            <w:tcW w:type="dxa" w:w="2880"/>
+          </w:tcPr>
+          <w:p>
+            <w:r>
+              <w:t>Highest commit p99 across members</w:t>
+            </w:r>
+          </w:p>
+        </w:tc>
+        <w:tc>
+          <w:tcPr>
+            <w:tcW w:type="dxa" w:w="2880"/>
+          </w:tcPr>
+          <w:p>
+            <w:r>
+              <w:t>&gt; 25</w:t>
             </w:r>
           </w:p>
         </w:tc>
@@ -2491,10 +2353,6 @@
     <w:name w:val="Normal"/>
     <w:qFormat/>
     <w:rsid w:val="00FC693F"/>
-    <w:rPr>
-      <w:rFonts w:ascii="Calibri" w:hAnsi="Calibri"/>
-      <w:sz w:val="22"/>
-    </w:rPr>
   </w:style>
   <w:style w:type="paragraph" w:styleId="Header">
     <w:name w:val="header"/>

</xml_diff>